<commit_message>
finesst: second pass of method detail on proposals (plan-only)
v3.docx + basic.md: DoD uncertainty in quadrature (1.96*sqrt(NMAD1^2+NMAD2^2)),
EPSG:3294 common-CRS reprojection + epoch resample, minimum-mapping-unit patch
filter, standing-water screen. Methods-only; no results or figures.

Co-Authored-By: Claude Fable 5 <noreply@anthropic.com>
</commit_message>
<xml_diff>
--- a/barlow/docs/finesst_proposal_v3.docx
+++ b/barlow/docs/finesst_proposal_v3.docx
@@ -552,7 +552,7 @@
         </w:numPr>
       </w:pPr>
       <w:r>
-        <w:t>Apply the per-pixel thresholds from objective 3 across the whole valley-floor surface and pull out every patch of change as a connected group of pixels that clear the threshold.</w:t>
+        <w:t>Apply the per-pixel thresholds from objective 3 across the whole valley-floor surface and pull out every patch of change as a connected group of pixels that clear the threshold. I drop patches smaller than a minimum mapping unit (a few pixels) to suppress isolated-pixel noise, and screen out near-level standing water, whose apparent change is lake-level rise rather than ground change — those go to the lake-margin class and the lake-level driver instead.</w:t>
       </w:r>
     </w:p>
     <w:p>
@@ -634,7 +634,7 @@
     </w:p>
     <w:p>
       <w:r>
-        <w:t>Note that all methods use robust statistics, since elevation errors here are heavy-tailed and an ordinary standard deviation would be thrown off by a few blunders. The noise scale throughout is the NMAD (1.4826 times the median absolute deviation from the median), and the detection floor is LOD95 = 1.96 x NMAD, the change that noise alone clears only 5% of the time.</w:t>
+        <w:t>Note that all methods use robust statistics, since elevation errors here are heavy-tailed and an ordinary standard deviation would be thrown off by a few blunders. The noise scale throughout is the NMAD (1.4826 times the median absolute deviation from the median). For a single surface the detection floor is LOD95 = 1.96 x NMAD; since a difference subtracts two noisy surfaces, their NMADs add in quadrature, so the differencing floor is 1.96 x sqrt(NMAD1^2 + NMAD2^2), the change that noise alone clears only 5% of the time. Everything (DEMs, channel outlines, driver fields) is reprojected to one common Antarctic polar-stereographic grid (EPSG:3294) first, and the two lidar epochs (2 m and 1 m native) are resampled to a shared cell size before differencing.</w:t>
       </w:r>
     </w:p>
     <w:p/>

</xml_diff>

<commit_message>
finesst: add two illustrative figures to proposals (plan-only, anonymous)
fig_workflow.png (detection-to-attribution method schematic) + fig_location.png
(study-area orientation: Antarctic index + Taylor Valley schematic). Both are
conceptual, results-free, and carry no name/institution for dual-anonymous review.
Embedded in v3.docx (Setup + Approach) and basic.md with captions.

Co-Authored-By: Claude Fable 5 <noreply@anthropic.com>
</commit_message>
<xml_diff>
--- a/barlow/docs/finesst_proposal_v3.docx
+++ b/barlow/docs/finesst_proposal_v3.docx
@@ -135,6 +135,58 @@
           <w:b w:val="0"/>
         </w:rPr>
         <w:t xml:space="preserve"> streams (periodic channels that flow only during a brief melting season) which can carry more water, move sediment, and reshape the terrain.</w:t>
+      </w:r>
+    </w:p>
+    <w:p>
+      <w:pPr>
+        <w:jc w:val="center"/>
+      </w:pPr>
+      <w:r>
+        <w:drawing>
+          <wp:inline xmlns:a="http://schemas.openxmlformats.org/drawingml/2006/main" xmlns:pic="http://schemas.openxmlformats.org/drawingml/2006/picture">
+            <wp:extent cx="5486400" cy="2592475"/>
+            <wp:docPr id="1" name="Picture 1"/>
+            <wp:cNvGraphicFramePr>
+              <a:graphicFrameLocks noChangeAspect="1"/>
+            </wp:cNvGraphicFramePr>
+            <a:graphic>
+              <a:graphicData uri="http://schemas.openxmlformats.org/drawingml/2006/picture">
+                <pic:pic>
+                  <pic:nvPicPr>
+                    <pic:cNvPr id="0" name="fig_location.png"/>
+                    <pic:cNvPicPr/>
+                  </pic:nvPicPr>
+                  <pic:blipFill>
+                    <a:blip r:embed="rId7"/>
+                    <a:stretch>
+                      <a:fillRect/>
+                    </a:stretch>
+                  </pic:blipFill>
+                  <pic:spPr>
+                    <a:xfrm>
+                      <a:off x="0" y="0"/>
+                      <a:ext cx="5486400" cy="2592475"/>
+                    </a:xfrm>
+                    <a:prstGeom prst="rect"/>
+                  </pic:spPr>
+                </pic:pic>
+              </a:graphicData>
+            </a:graphic>
+          </wp:inline>
+        </w:drawing>
+      </w:r>
+    </w:p>
+    <w:p>
+      <w:pPr>
+        <w:jc w:val="center"/>
+      </w:pPr>
+      <w:r>
+        <w:rPr>
+          <w:i/>
+          <w:color w:val="404040"/>
+          <w:sz w:val="18"/>
+        </w:rPr>
+        <w:t>Figure 1. Study-area orientation (schematic): the McMurdo Dry Valleys within Antarctica (A) and the Taylor Valley stream-lake system (B). For orientation only - not to scale, no data shown.</w:t>
       </w:r>
     </w:p>
     <w:p>
@@ -475,6 +527,58 @@
     <w:p>
       <w:r>
         <w:t>Our approach is as follows:</w:t>
+      </w:r>
+    </w:p>
+    <w:p>
+      <w:pPr>
+        <w:jc w:val="center"/>
+      </w:pPr>
+      <w:r>
+        <w:drawing>
+          <wp:inline xmlns:a="http://schemas.openxmlformats.org/drawingml/2006/main" xmlns:pic="http://schemas.openxmlformats.org/drawingml/2006/picture">
+            <wp:extent cx="5486400" cy="3830432"/>
+            <wp:docPr id="2" name="Picture 2"/>
+            <wp:cNvGraphicFramePr>
+              <a:graphicFrameLocks noChangeAspect="1"/>
+            </wp:cNvGraphicFramePr>
+            <a:graphic>
+              <a:graphicData uri="http://schemas.openxmlformats.org/drawingml/2006/picture">
+                <pic:pic>
+                  <pic:nvPicPr>
+                    <pic:cNvPr id="0" name="fig_workflow.png"/>
+                    <pic:cNvPicPr/>
+                  </pic:nvPicPr>
+                  <pic:blipFill>
+                    <a:blip r:embed="rId8"/>
+                    <a:stretch>
+                      <a:fillRect/>
+                    </a:stretch>
+                  </pic:blipFill>
+                  <pic:spPr>
+                    <a:xfrm>
+                      <a:off x="0" y="0"/>
+                      <a:ext cx="5486400" cy="3830432"/>
+                    </a:xfrm>
+                    <a:prstGeom prst="rect"/>
+                  </pic:spPr>
+                </pic:pic>
+              </a:graphicData>
+            </a:graphic>
+          </wp:inline>
+        </w:drawing>
+      </w:r>
+    </w:p>
+    <w:p>
+      <w:pPr>
+        <w:jc w:val="center"/>
+      </w:pPr>
+      <w:r>
+        <w:rPr>
+          <w:i/>
+          <w:color w:val="404040"/>
+          <w:sz w:val="18"/>
+        </w:rPr>
+        <w:t>Figure 2. Planned detection-to-attribution workflow: three DEM epochs, co-registration, DEM-of-Difference, per-pixel detection floor, then the O1 (channel), O2 (valley-floor), and O3 (uncertainty) objectives. Method schematic; no results shown.</w:t>
       </w:r>
     </w:p>
     <w:p>

</xml_diff>

<commit_message>
finesst: split docx lineage - v3=technical detail, v4=+figures
Figures belonged in a new version, not stacked on v3. v3.docx rolled back to
its pre-figures state (technical detail only); v4.docx = v3 + the two
illustrative figures. One version per request.

Co-Authored-By: Claude Fable 5 <noreply@anthropic.com>
</commit_message>
<xml_diff>
--- a/barlow/docs/finesst_proposal_v3.docx
+++ b/barlow/docs/finesst_proposal_v3.docx
@@ -135,58 +135,6 @@
           <w:b w:val="0"/>
         </w:rPr>
         <w:t xml:space="preserve"> streams (periodic channels that flow only during a brief melting season) which can carry more water, move sediment, and reshape the terrain.</w:t>
-      </w:r>
-    </w:p>
-    <w:p>
-      <w:pPr>
-        <w:jc w:val="center"/>
-      </w:pPr>
-      <w:r>
-        <w:drawing>
-          <wp:inline xmlns:a="http://schemas.openxmlformats.org/drawingml/2006/main" xmlns:pic="http://schemas.openxmlformats.org/drawingml/2006/picture">
-            <wp:extent cx="5486400" cy="2592475"/>
-            <wp:docPr id="1" name="Picture 1"/>
-            <wp:cNvGraphicFramePr>
-              <a:graphicFrameLocks noChangeAspect="1"/>
-            </wp:cNvGraphicFramePr>
-            <a:graphic>
-              <a:graphicData uri="http://schemas.openxmlformats.org/drawingml/2006/picture">
-                <pic:pic>
-                  <pic:nvPicPr>
-                    <pic:cNvPr id="0" name="fig_location.png"/>
-                    <pic:cNvPicPr/>
-                  </pic:nvPicPr>
-                  <pic:blipFill>
-                    <a:blip r:embed="rId7"/>
-                    <a:stretch>
-                      <a:fillRect/>
-                    </a:stretch>
-                  </pic:blipFill>
-                  <pic:spPr>
-                    <a:xfrm>
-                      <a:off x="0" y="0"/>
-                      <a:ext cx="5486400" cy="2592475"/>
-                    </a:xfrm>
-                    <a:prstGeom prst="rect"/>
-                  </pic:spPr>
-                </pic:pic>
-              </a:graphicData>
-            </a:graphic>
-          </wp:inline>
-        </w:drawing>
-      </w:r>
-    </w:p>
-    <w:p>
-      <w:pPr>
-        <w:jc w:val="center"/>
-      </w:pPr>
-      <w:r>
-        <w:rPr>
-          <w:i/>
-          <w:color w:val="404040"/>
-          <w:sz w:val="18"/>
-        </w:rPr>
-        <w:t>Figure 1. Study-area orientation (schematic): the McMurdo Dry Valleys within Antarctica (A) and the Taylor Valley stream-lake system (B). For orientation only - not to scale, no data shown.</w:t>
       </w:r>
     </w:p>
     <w:p>
@@ -527,58 +475,6 @@
     <w:p>
       <w:r>
         <w:t>Our approach is as follows:</w:t>
-      </w:r>
-    </w:p>
-    <w:p>
-      <w:pPr>
-        <w:jc w:val="center"/>
-      </w:pPr>
-      <w:r>
-        <w:drawing>
-          <wp:inline xmlns:a="http://schemas.openxmlformats.org/drawingml/2006/main" xmlns:pic="http://schemas.openxmlformats.org/drawingml/2006/picture">
-            <wp:extent cx="5486400" cy="3830432"/>
-            <wp:docPr id="2" name="Picture 2"/>
-            <wp:cNvGraphicFramePr>
-              <a:graphicFrameLocks noChangeAspect="1"/>
-            </wp:cNvGraphicFramePr>
-            <a:graphic>
-              <a:graphicData uri="http://schemas.openxmlformats.org/drawingml/2006/picture">
-                <pic:pic>
-                  <pic:nvPicPr>
-                    <pic:cNvPr id="0" name="fig_workflow.png"/>
-                    <pic:cNvPicPr/>
-                  </pic:nvPicPr>
-                  <pic:blipFill>
-                    <a:blip r:embed="rId8"/>
-                    <a:stretch>
-                      <a:fillRect/>
-                    </a:stretch>
-                  </pic:blipFill>
-                  <pic:spPr>
-                    <a:xfrm>
-                      <a:off x="0" y="0"/>
-                      <a:ext cx="5486400" cy="3830432"/>
-                    </a:xfrm>
-                    <a:prstGeom prst="rect"/>
-                  </pic:spPr>
-                </pic:pic>
-              </a:graphicData>
-            </a:graphic>
-          </wp:inline>
-        </w:drawing>
-      </w:r>
-    </w:p>
-    <w:p>
-      <w:pPr>
-        <w:jc w:val="center"/>
-      </w:pPr>
-      <w:r>
-        <w:rPr>
-          <w:i/>
-          <w:color w:val="404040"/>
-          <w:sz w:val="18"/>
-        </w:rPr>
-        <w:t>Figure 2. Planned detection-to-attribution workflow: three DEM epochs, co-registration, DEM-of-Difference, per-pixel detection floor, then the O1 (channel), O2 (valley-floor), and O3 (uncertainty) objectives. Method schematic; no results shown.</w:t>
       </w:r>
     </w:p>
     <w:p>

</xml_diff>